<commit_message>
feat(timeline): magnetic toggle on the track head
The last piece of M1. A magnet on each track head turns packing on and off, and
reports its state through aria-pressed rather than colour alone.

It lives on the track head because magnetic is a property of a track: a global
control would have to ask which one, and the answer is already implied by where
you clicked. Dimmed until it is on, because an unmarked track is the default and
a row of bright magnets would read as state rather than as an offer.

The e2e checks the property that makes per-track worth doing: an ordinary track
keeps its gaps while a magnetic one closes them. Plus packing on toggle, and the
flag surviving undo.
</commit_message>
<xml_diff>
--- a/docs/Project_Director_User_Manual.docx
+++ b/docs/Project_Director_User_Manual.docx
@@ -1375,6 +1375,14 @@
       </w:pPr>
       <w:r>
         <w:t xml:space="preserve">Compound turns the selected clips into a single clip that plays them, moving their contents into a sequence of their own. Effects, animations, speed and blend mode come along, and the whole thing is one Undo. Useful when a run of clips has become one thing you want to move, trim or grade together.</w:t>
+      </w:r>
+    </w:p>
+    <w:p>
+      <w:pPr>
+        <w:pStyle w:val="ListBullet"/>
+      </w:pPr>
+      <w:r>
+        <w:t xml:space="preserve">The magnet button on a track head makes that track magnetic: its clips stay packed end to end, so deleting one closes the gap, adding one pushes the rest along, and dragging one past a neighbour swaps them. It is per track — other tracks are unaffected, and an ordinary track still allows gaps.</w:t>
       </w:r>
     </w:p>
     <w:p>

</xml_diff>

<commit_message>
docs(manual): put raw import in the Word manual, where it never landed
The raw-import commit updated USER_MANUAL.md and said it updated the docx. It
did not: the docx's last change was the motion-tracking commit, so the Markdown
claimed camera raw support and the Word version said nothing about it.

The patch script reported success and the install step printed "installed", but
the two were chained with `&&` after a heredoc whose Python had already failed —
so the rezip ran on unmodified content and copied a byte-identical file back.
Nothing verified that the text was actually present afterwards, which is the
only check that would have caught it.

Fixed by patching from the current docx and then *reading the installed file
back* to confirm each phrase is in it, rather than trusting an exit status. The
same check would have failed loudly the first time.

Also adds the .cube note for this branch's change, marked as no user-visible
change because nothing in the interface offers it yet.
</commit_message>
<xml_diff>
--- a/docs/Project_Director_User_Manual.docx
+++ b/docs/Project_Director_User_Manual.docx
@@ -1326,6 +1326,30 @@
         <w:pStyle w:val="ListBullet"/>
       </w:pPr>
       <w:r>
+        <w:t xml:space="preserve">Camera raw files are recognised by their contents rather than their extension, so a renamed file still opens. A DNG is developed on import — black level, colour filter array, white balance and the camera’s own colour matrix — and lands in the bin as an ordinary picture you can grade, animate and export like any other.</w:t>
+      </w:r>
+    </w:p>
+    <w:p>
+      <w:pPr>
+        <w:pStyle w:val="ListBullet"/>
+      </w:pPr>
+      <w:r>
+        <w:t xml:space="preserve">Only uncompressed DNGs open at present. A compressed DNG, or a vendor format such as Canon CR3 or Nikon NEF, is refused with a message naming the camera and format and saying the extended decoder is not loaded, rather than failing silently or blaming the file.</w:t>
+      </w:r>
+    </w:p>
+    <w:p>
+      <w:pPr>
+        <w:pStyle w:val="ListBullet"/>
+      </w:pPr>
+      <w:r>
+        <w:t xml:space="preserve">Colour lookup tables in the .cube format can be read and written internally. Nothing in the interface offers this yet; when it does, a table exported from Resolve or Premiere will load as an ordinary grade.</w:t>
+      </w:r>
+    </w:p>
+    <w:p>
+      <w:pPr>
+        <w:pStyle w:val="ListBullet"/>
+      </w:pPr>
+      <w:r>
         <w:t>Images receive a default five-second duration. Video and audio duration comes from browser metadata when available.</w:t>
       </w:r>
     </w:p>

</xml_diff>

<commit_message>
docs: drop the sentence this change supersedes
The sync brought main's manuals back wholesale and re-applied only the
lines this branch added, so the sentence it replaced returned alongside
its replacement and the manual contradicted itself. Removed here; the
script's inability to carry a deletion is fixed separately.
</commit_message>
<xml_diff>
--- a/docs/Project_Director_User_Manual.docx
+++ b/docs/Project_Director_User_Manual.docx
@@ -1358,14 +1358,6 @@
         <w:pStyle w:val="ListBullet"/>
       </w:pPr>
       <w:r>
-        <w:t xml:space="preserve">Only uncompressed DNGs open at present. A compressed DNG, or a vendor format such as Canon CR3 or Nikon NEF, is refused with a message naming the camera and format and saying the extended decoder is not loaded, rather than failing silently or blaming the file.</w:t>
-      </w:r>
-    </w:p>
-    <w:p>
-      <w:pPr>
-        <w:pStyle w:val="ListBullet"/>
-      </w:pPr>
-      <w:r>
         <w:t xml:space="preserve">Both uncompressed and losslessly compressed DNGs open — the second being what cameras actually write; uncompressed ones are mostly conversions. A vendor format such as Canon CR3 or Nikon NEF is still refused with a message naming the camera and format and saying the extended decoder is not loaded, rather than failing silently or blaming the file.</w:t>
       </w:r>
     </w:p>

</xml_diff>

<commit_message>
docs: put the raw import screenshot in the Word manual too
The Markdown manual gained the screenshot and the Word manual did not, so
the two formats disagreed and manual:check failed — correctly. The plate is
embedded properly: the image added to the archive, a relationship pointing
at it, and a drawing referencing that relationship, sized by height so a
portrait screenshot matches the other plates rather than running the full
text width.
</commit_message>
<xml_diff>
--- a/docs/Project_Director_User_Manual.docx
+++ b/docs/Project_Director_User_Manual.docx
@@ -1355,6 +1355,53 @@
     </w:p>
     <w:p>
       <w:pPr>
+        <w:jc w:val="center"/>
+      </w:pPr>
+      <w:r>
+        <w:drawing>
+          <wp:inline xmlns:a="http://schemas.openxmlformats.org/drawingml/2006/main" xmlns:pic="http://schemas.openxmlformats.org/drawingml/2006/picture">
+            <wp:extent cx="3925584" cy="4445000"/>
+            <wp:docPr id="6" name="Picture 6"/>
+            <wp:cNvGraphicFramePr>
+              <a:graphicFrameLocks noChangeAspect="1"/>
+            </wp:cNvGraphicFramePr>
+            <a:graphic>
+              <a:graphicData uri="http://schemas.openxmlformats.org/drawingml/2006/picture">
+                <pic:pic>
+                  <pic:nvPicPr>
+                    <pic:cNvPr id="0" name="raw-import.png"/>
+                    <pic:cNvPicPr/>
+                  </pic:nvPicPr>
+                  <pic:blipFill>
+                    <a:blip r:embed="rId16"/>
+                    <a:stretch>
+                      <a:fillRect/>
+                    </a:stretch>
+                  </pic:blipFill>
+                  <pic:spPr>
+                    <a:xfrm>
+                      <a:off x="0" y="0"/>
+                      <a:ext cx="3925584" cy="4445000"/>
+                    </a:xfrm>
+                    <a:prstGeom prst="rect"/>
+                  </pic:spPr>
+                </pic:pic>
+              </a:graphicData>
+            </a:graphic>
+          </wp:inline>
+        </w:drawing>
+      </w:r>
+    </w:p>
+    <w:p>
+      <w:pPr>
+        <w:pStyle w:val="Caption"/>
+      </w:pPr>
+      <w:r>
+        <w:t xml:space="preserve">A developed DNG in the preview.</w:t>
+      </w:r>
+    </w:p>
+    <w:p>
+      <w:pPr>
         <w:pStyle w:val="ListBullet"/>
       </w:pPr>
       <w:r>

</xml_diff>